<commit_message>
Verify grading for student_submission_example2: PASSED
Independent verification confirms all verdicts are correct:
- Q1-Q2: Correct answers verified
- Q3: Incorrect answer correctly identified
- Q4-Q5: Incomplete submissions correctly noted

All annotations are accurate and properly placed. No discrepancies found.
Added "Review Passed" mark in blue text.

Co-Authored-By: Claude Haiku 4.5 <noreply@anthropic.com>
</commit_message>
<xml_diff>
--- a/graded-submissions/student_submission_example2_Graded.docx
+++ b/graded-submissions/student_submission_example2_Graded.docx
@@ -652,6 +652,12 @@
         </w:rPr>
         <w:t>Grading Completed</w:t>
       </w:r>
+      <w:r>
+        <w:rPr>
+          <w:color w:val="0000FF"/>
+        </w:rPr>
+        <w:t xml:space="preserve"> | Review Passed</w:t>
+      </w:r>
     </w:p>
     <w:sectPr>
       <w:pgSz w:w="12240" w:h="15840"/>

</xml_diff>